<commit_message>
updated the AVCDL Traceability certification document / certification document section readme
</commit_message>
<xml_diff>
--- a/source/reference_documents/certification_documents/AVCDL Traceability/AVCDL Traceability.docx
+++ b/source/reference_documents/certification_documents/AVCDL Traceability/AVCDL Traceability.docx
@@ -55,7 +55,7 @@
           <w:rFonts w:cs="Arial"/>
           <w:szCs w:val="22"/>
         </w:rPr>
-        <w:t>1</w:t>
+        <w:t>2</w:t>
       </w:r>
     </w:p>
     <w:p>
@@ -92,7 +92,7 @@
           <w:noProof/>
           <w:szCs w:val="22"/>
         </w:rPr>
-        <w:t>5/19/25 10:07 AM</w:t>
+        <w:t>10/28/25 9:07 AM</w:t>
       </w:r>
       <w:r>
         <w:rPr>
@@ -159,23 +159,7 @@
           <w:color w:val="000000" w:themeColor="text1"/>
           <w:szCs w:val="22"/>
         </w:rPr>
-        <w:t>provides a</w:t>
-      </w:r>
-      <w:r>
-        <w:rPr>
-          <w:rFonts w:cs="Arial"/>
-          <w:color w:val="000000" w:themeColor="text1"/>
-          <w:szCs w:val="22"/>
-        </w:rPr>
-        <w:t xml:space="preserve"> visual overview of how the</w:t>
-      </w:r>
-      <w:r>
-        <w:rPr>
-          <w:rFonts w:cs="Arial"/>
-          <w:color w:val="000000" w:themeColor="text1"/>
-          <w:szCs w:val="22"/>
-        </w:rPr>
-        <w:t xml:space="preserve"> </w:t>
+        <w:t xml:space="preserve">provides a visual overview of how the </w:t>
       </w:r>
       <w:r>
         <w:rPr>
@@ -419,7 +403,39 @@
           <w:color w:val="000000" w:themeColor="text1"/>
           <w:szCs w:val="22"/>
         </w:rPr>
-        <w:t>creating a safety-critical, cyber-physical system</w:t>
+        <w:t>creation</w:t>
+      </w:r>
+      <w:r>
+        <w:rPr>
+          <w:rFonts w:cs="Arial"/>
+          <w:color w:val="000000" w:themeColor="text1"/>
+          <w:szCs w:val="22"/>
+        </w:rPr>
+        <w:t xml:space="preserve"> </w:t>
+      </w:r>
+      <w:r>
+        <w:rPr>
+          <w:rFonts w:cs="Arial"/>
+          <w:color w:val="000000" w:themeColor="text1"/>
+          <w:szCs w:val="22"/>
+        </w:rPr>
+        <w:t xml:space="preserve">of </w:t>
+      </w:r>
+      <w:r>
+        <w:rPr>
+          <w:rFonts w:cs="Arial"/>
+          <w:color w:val="000000" w:themeColor="text1"/>
+          <w:szCs w:val="22"/>
+        </w:rPr>
+        <w:t>safety-critical, cyber-physical system</w:t>
+      </w:r>
+      <w:r>
+        <w:rPr>
+          <w:rFonts w:cs="Arial"/>
+          <w:color w:val="000000" w:themeColor="text1"/>
+          <w:szCs w:val="22"/>
+        </w:rPr>
+        <w:t>s</w:t>
       </w:r>
       <w:r>
         <w:rPr>
@@ -450,13 +466,7 @@
         <w:pStyle w:val="FirstParagraph"/>
       </w:pPr>
       <w:r>
-        <w:t>The following diagram</w:t>
-      </w:r>
-      <w:r>
-        <w:t>s</w:t>
-      </w:r>
-      <w:r>
-        <w:t xml:space="preserve"> shows the dependencies between the products from the AVCDL process requirements</w:t>
+        <w:t>The following diagram shows the end-to-end AVCDL phase product dependencies</w:t>
       </w:r>
       <w:r>
         <w:t>.</w:t>
@@ -467,39 +477,7 @@
     </w:p>
     <w:p>
       <w:pPr>
-        <w:pStyle w:val="BodyText"/>
-        <w:spacing w:after="480"/>
-      </w:pPr>
-      <w:r>
-        <w:t xml:space="preserve">For more information regarding the interpretation of these diagrams, refer to the </w:t>
-      </w:r>
-      <w:hyperlink w:anchor="understandingthephaseproductdependencies" w:history="1">
-        <w:r>
-          <w:rPr>
-            <w:rStyle w:val="Hyperlink"/>
-            <w:bCs/>
-          </w:rPr>
-          <w:t>Understanding the Phase Product Dependencies Graph</w:t>
-        </w:r>
-      </w:hyperlink>
-      <w:r>
-        <w:t xml:space="preserve"> secondary document.</w:t>
-      </w:r>
-    </w:p>
-    <w:p>
-      <w:pPr>
-        <w:pStyle w:val="BodyText"/>
-        <w:spacing w:after="480"/>
-      </w:pPr>
-      <w:r>
-        <w:t>The following diagram shows the end-to-end AVCDL phase product dependencies.</w:t>
-      </w:r>
-    </w:p>
-    <w:p>
-      <w:pPr>
-        <w:pStyle w:val="BodyText"/>
-        <w:keepNext/>
-        <w:spacing w:before="240" w:after="0"/>
+        <w:pStyle w:val="FirstParagraph"/>
       </w:pPr>
       <w:r>
         <w:rPr>
@@ -550,26 +528,37 @@
       <w:r>
         <w:t xml:space="preserve">Figure </w:t>
       </w:r>
-      <w:r>
-        <w:fldChar w:fldCharType="begin"/>
-      </w:r>
-      <w:r>
-        <w:instrText xml:space="preserve"> SEQ Figure \* ARABIC </w:instrText>
-      </w:r>
-      <w:r>
-        <w:fldChar w:fldCharType="separate"/>
-      </w:r>
-      <w:r>
-        <w:rPr>
-          <w:noProof/>
-        </w:rPr>
-        <w:t>1</w:t>
-      </w:r>
-      <w:r>
-        <w:fldChar w:fldCharType="end"/>
-      </w:r>
+      <w:fldSimple w:instr=" SEQ Figure \* ARABIC ">
+        <w:r>
+          <w:rPr>
+            <w:noProof/>
+          </w:rPr>
+          <w:t>1</w:t>
+        </w:r>
+      </w:fldSimple>
       <w:r>
         <w:t xml:space="preserve"> - AVCDL phase dependencies</w:t>
+      </w:r>
+    </w:p>
+    <w:p>
+      <w:pPr>
+        <w:pStyle w:val="BodyText"/>
+        <w:spacing w:after="0"/>
+      </w:pPr>
+      <w:r>
+        <w:t xml:space="preserve">For more information regarding the interpretation of these diagrams, refer to the </w:t>
+      </w:r>
+      <w:hyperlink w:anchor="understandingthephaseproductdependencies" w:history="1">
+        <w:r>
+          <w:rPr>
+            <w:rStyle w:val="Hyperlink"/>
+            <w:bCs/>
+          </w:rPr>
+          <w:t>Understanding the Phase Product Dependencies Graph</w:t>
+        </w:r>
+      </w:hyperlink>
+      <w:r>
+        <w:t xml:space="preserve"> secondary document.</w:t>
       </w:r>
     </w:p>
     <w:p>

</xml_diff>